<commit_message>
Refine 10/01 Lilly call minutes: confirmed attendees, activation tank term, photo and follow-up wording
Co-authored-by: peterli0913 <peterli0913@users.noreply.github.com>
</commit_message>
<xml_diff>
--- a/meetings/2026/2026-10-01-礼来Tracker高风险项会议纪要.docx
+++ b/meetings/2026/2026-10-01-礼来Tracker高风险项会议纪要.docx
@@ -352,27 +352,7 @@
                 <w:color w:val="1C2833"/>
                 <w:sz w:val="20"/>
               </w:rPr>
-              <w:t>主讲人（我方称其 Mark）、现场人员（四周前要过焊缝照片，可能是 Peter）等；会上提到 Andrew（纯化）、Chris（清洁 SME）（姓名</w:t>
-            </w:r>
-            <w:r>
-              <w:rPr>
-                <w:rFonts w:ascii="Arial" w:hAnsi="Arial" w:eastAsia="微软雅黑"/>
-                <w:b/>
-                <w:i w:val="0"/>
-                <w:color w:val="C0392B"/>
-                <w:sz w:val="20"/>
-              </w:rPr>
-              <w:t>需核实</w:t>
-            </w:r>
-            <w:r>
-              <w:rPr>
-                <w:rFonts w:ascii="Arial" w:hAnsi="Arial" w:eastAsia="微软雅黑"/>
-                <w:b w:val="0"/>
-                <w:i w:val="0"/>
-                <w:color w:val="1C2833"/>
-                <w:sz w:val="20"/>
-              </w:rPr>
-              <w:t>）</w:t>
+              <w:t>主讲人 Mark、现场人员 Peter（会上索要焊缝照片）等；会上提到 Andrew（纯化）、Chris（清洁 SME）</w:t>
             </w:r>
           </w:p>
         </w:tc>
@@ -433,7 +413,7 @@
                 <w:color w:val="1C2833"/>
                 <w:sz w:val="20"/>
               </w:rPr>
-              <w:t>项目协调（英文沟通，会中与同事用中文商量）、技术 / QA 负责人（清洁、管路确认、钝化、纯水）等（姓名</w:t>
+              <w:t>项目协调（英文沟通，会中与同事用中文商量）、周博士（主讲清洁、管路确认、钝化、纯水）等（其他姓名</w:t>
             </w:r>
             <w:r>
               <w:rPr>
@@ -636,7 +616,7 @@
           <w:color w:val="1C2833"/>
           <w:sz w:val="21"/>
         </w:rPr>
-        <w:t>礼来最担心的是溶剂总管（未钝化 + 活化罐上方锈蚀焊缝）带入金属杂质（No. 20）。礼来明确表示这可能卡 pre-PPQ 启动，活化罐残留偏差要在 SPPS pre-PPQ 前调查清楚并关闭；“用过滤去除金属”的说法很难说服其 QA。</w:t>
+        <w:t>礼来最担心的是溶剂总管（未钝化 + 激活罐上方锈蚀焊缝）带入金属杂质（No. 20）。礼来明确表示这可能卡 pre-PPQ 启动，激活罐残留偏差要在 SPPS pre-PPQ 前调查清楚并关闭；“用过滤去除金属”的说法很难说服其 QA。</w:t>
       </w:r>
     </w:p>
     <w:p>
@@ -2875,7 +2855,7 @@
           <w:color w:val="1B4F72"/>
           <w:sz w:val="24"/>
         </w:rPr>
-        <w:t>4. 溶剂总管钝化、焊缝质量与金属风险（No. 20；关联活化罐残留偏差）</w:t>
+        <w:t>4. 溶剂总管钝化、焊缝质量与金属风险（No. 20；关联激活罐残留偏差）</w:t>
       </w:r>
     </w:p>
     <w:tbl>
@@ -3009,7 +2989,7 @@
                 <w:color w:val="1C2833"/>
                 <w:sz w:val="19"/>
               </w:rPr>
-              <w:t>• 礼来的理解：溶剂储罐和溶剂总管未钝化；活化罐上方的总管（从大宗溶剂总管引出的较新管段）有一个焊缝锈蚀或质量差，与活化罐残留偏差可能有关（请我方纠正理解偏差）。</w:t>
+              <w:t>• 礼来的理解：溶剂储罐和溶剂总管未钝化；激活罐上方的总管（从大宗溶剂总管引出的较新管段）有一个焊缝锈蚀或质量差，与激活罐残留偏差可能有关（请我方纠正理解偏差）。</w:t>
             </w:r>
           </w:p>
           <w:p>
@@ -3061,7 +3041,7 @@
                 <w:color w:val="1C2833"/>
                 <w:sz w:val="19"/>
               </w:rPr>
-              <w:t>• 具体要求：提供锈蚀焊缝照片（现场人员四周前的周五下午已要求拍照，至今未收到）；确认是手工焊还是自动轨道焊；是否只是这一处，同一或类似总管上还有没有手工焊缝；讨论对同类焊缝做抽检（目视和 / 或内窥镜），先了解我方能力。</w:t>
+              <w:t>• 具体要求：提供锈蚀焊缝照片（Peter 称四周前的周五下午已要求拍照，至今未收到）；确认是手工焊还是自动轨道焊；是否只是这一处，同一或类似总管上还有没有手工焊缝；讨论对同类焊缝做抽检（目视和 / 或内窥镜），先了解我方能力。</w:t>
             </w:r>
           </w:p>
           <w:p>
@@ -3256,7 +3236,7 @@
                 <w:color w:val="1C2833"/>
                 <w:sz w:val="19"/>
               </w:rPr>
-              <w:t>• 设备之间、反应釜之间的管路已包含钝化；罐区到反应釜之间的管路之前没有包含，会补进钝化范围，重新给出时间线。</w:t>
+              <w:t>• 设备之间、反应釜之间的管路已做钝化；罐区到反应釜之间的溶剂管路之前没有包含，会补进钝化范围，重新给出时间线。</w:t>
             </w:r>
           </w:p>
           <w:p>
@@ -3396,7 +3376,27 @@
                 <w:color w:val="1C2833"/>
                 <w:sz w:val="19"/>
               </w:rPr>
-              <w:t>焊缝照片拖了四周；过滤方案被当场否定；Tracker F 列写的是二期罐区交付后钝化（02/17/2027），远晚于 pre-PPQ。这是本次会议最可能直接影响 pre-PPQ 启动的一项。</w:t>
+              <w:t>礼来称焊缝照片要了四周仍未收到（偏差附件里是否已有照片或示意图、是否正式发给过礼来，</w:t>
+            </w:r>
+            <w:r>
+              <w:rPr>
+                <w:rFonts w:ascii="Arial" w:hAnsi="Arial" w:eastAsia="微软雅黑"/>
+                <w:b/>
+                <w:i w:val="0"/>
+                <w:color w:val="C0392B"/>
+                <w:sz w:val="19"/>
+              </w:rPr>
+              <w:t>需核实</w:t>
+            </w:r>
+            <w:r>
+              <w:rPr>
+                <w:rFonts w:ascii="Arial" w:hAnsi="Arial" w:eastAsia="微软雅黑"/>
+                <w:b w:val="0"/>
+                <w:i w:val="0"/>
+                <w:color w:val="1C2833"/>
+                <w:sz w:val="19"/>
+              </w:rPr>
+              <w:t>）；过滤方案被当场否定；Tracker F 列写的是二期罐区交付后钝化（02/17/2027），远晚于 pre-PPQ。这是本次会议最可能直接影响 pre-PPQ 启动的一项。</w:t>
             </w:r>
           </w:p>
         </w:tc>
@@ -3681,7 +3681,7 @@
                 <w:color w:val="1C2833"/>
                 <w:sz w:val="19"/>
               </w:rPr>
-              <w:t>• 早期工序先改进现行做法：规定使用后排空管路，使用前用新软管或先冲洗使用点到分配点之间的管路（转写不清，</w:t>
+              <w:t>• 早期工序先改进现行做法：规定软管使用后立即排空，使用前冲洗用水点到设备之间的管路（转写不清，具体措施</w:t>
             </w:r>
             <w:r>
               <w:rPr>
@@ -3881,7 +3881,7 @@
           <w:color w:val="1C2833"/>
           <w:sz w:val="21"/>
         </w:rPr>
-        <w:t>我方 10/02 发送清洁管理资料（改进后的方案、SOP、记录）；礼来审阅后，如需讨论，可在 10/02 或 10/03 开会。</w:t>
+        <w:t>我方承诺 10/02 发送清洁管理资料（改进后的方案、SOP、记录），并提出如需讨论可在 10/02 或 10/03 开会；礼来没有直接答应，表示先看我方对今天讨论的反馈再定。</w:t>
       </w:r>
     </w:p>
     <w:p>
@@ -6120,7 +6120,7 @@
                 <w:color w:val="1C2833"/>
                 <w:sz w:val="19"/>
               </w:rPr>
-              <w:t>推进活化罐残留偏差调查和 CAPA，在 SPPS pre-PPQ 前关闭</w:t>
+              <w:t>推进激活罐残留偏差调查和 CAPA，在 SPPS pre-PPQ 前关闭</w:t>
             </w:r>
           </w:p>
         </w:tc>
@@ -6887,7 +6887,7 @@
                 <w:color w:val="1C2833"/>
                 <w:sz w:val="20"/>
               </w:rPr>
-              <w:t>礼来会上自己提出了 RS 共用段和储罐数据两条缩小范围的路径；明确否定了只靠过滤；把焊缝检查和偏差关闭列为 SPPS pre-PPQ 的前提。照片拖了四周，已影响信任。</w:t>
+              <w:t>礼来会上自己提出了 RS 共用段和储罐数据两条缩小范围的路径；明确否定了只靠过滤；把焊缝检查和偏差关闭列为 SPPS pre-PPQ 的前提。礼来称照片四周前就要过，已影响信任。</w:t>
             </w:r>
           </w:p>
         </w:tc>
@@ -7555,7 +7555,7 @@
           <w:color w:val="1C2833"/>
           <w:sz w:val="21"/>
         </w:rPr>
-        <w:t>说话人身份：说话人 1 是礼来主讲（我方称其 Mark）；说话人 6 是礼来现场人员（四周前要过照片，可能是 Peter）；说话人 2、3、5 为凯莱英；说话人 4 的发言混有双方内容。</w:t>
+        <w:t>说话人身份：说话人 1 为礼来主讲 Mark；说话人 6 为礼来现场人员 Peter；说话人 3 推断为我方周博士；说话人 2、5 为凯莱英；说话人 4 的发言混有双方内容。</w:t>
       </w:r>
     </w:p>
     <w:p>
@@ -7608,6 +7608,22 @@
           <w:sz w:val="21"/>
         </w:rPr>
         <w:t>SPPS 演示批后是否做过大清洁：转写为 “After it was used, we didn't major cleaning”，含义不清。</w:t>
+      </w:r>
+    </w:p>
+    <w:p>
+      <w:pPr>
+        <w:pStyle w:val="ListBullet"/>
+        <w:spacing w:after="40" w:line="288" w:lineRule="auto"/>
+      </w:pPr>
+      <w:r>
+        <w:rPr>
+          <w:rFonts w:ascii="Arial" w:hAnsi="Arial" w:eastAsia="微软雅黑"/>
+          <w:b w:val="0"/>
+          <w:i w:val="0"/>
+          <w:color w:val="1C2833"/>
+          <w:sz w:val="21"/>
+        </w:rPr>
+        <w:t>锈蚀焊缝的位置：礼来描述为“激活罐上方、从大宗溶剂总管引出的较新管段”，需与偏差记录中的位置和附件核对，回复礼来时以偏差记录为准。</w:t>
       </w:r>
     </w:p>
     <w:p>

</xml_diff>